<commit_message>
feat: add formLetterDate to UI and backend #BKDO-288
</commit_message>
<xml_diff>
--- a/src/Bk.APG.Api/Templates/FormLetterGeneralElection.docx
+++ b/src/Bk.APG.Api/Templates/FormLetterGeneralElection.docx
@@ -962,6 +962,9 @@
         <w:t>&lt;&lt;[formLetter.nextTermOfOfficeEndDate]:"dd.MM.yyyy"&gt;&gt;</w:t>
       </w:r>
       <w:r>
+        <w:t xml:space="preserve"> bestellt</w:t>
+      </w:r>
+      <w:r>
         <w:t>.</w:t>
       </w:r>
     </w:p>
@@ -1355,92 +1358,80 @@
         <w:t xml:space="preserve">Er hat von Ihrem Ausscheiden wegen Erreichen der maximalen Amtszeit per </w:t>
       </w:r>
       <w:r>
+        <w:t>&lt;&lt;[formLetter.</w:t>
+      </w:r>
+      <w:r>
+        <w:t>termOfOfficeEndDate</w:t>
+      </w:r>
+      <w:r>
+        <w:t>]:"dd.MM.yyyy"&gt;&gt;</w:t>
+      </w:r>
+      <w:r>
+        <w:t xml:space="preserve"> als </w:t>
+      </w:r>
+      <w:r>
+        <w:rPr>
+          <w:b/>
+          <w:bCs/>
+        </w:rPr>
         <w:t>&lt;&lt;[</w:t>
       </w:r>
       <w:r>
-        <w:t>formLetter</w:t>
-      </w:r>
-      <w:r>
-        <w:t>.</w:t>
+        <w:rPr>
+          <w:b/>
+          <w:bCs/>
+        </w:rPr>
+        <w:t>member</w:t>
+      </w:r>
+      <w:r>
+        <w:rPr>
+          <w:b/>
+          <w:bCs/>
+        </w:rPr>
+        <w:t>.function]&gt;&gt;</w:t>
+      </w:r>
+      <w:r>
+        <w:t xml:space="preserve"> in folgendem Gremium Kenntnis genommen:</w:t>
+      </w:r>
+      <w:r>
+        <w:rPr>
+          <w:highlight w:val="yellow"/>
+        </w:rPr>
+        <w:t>&lt;&lt;/if&gt;&gt;</w:t>
+      </w:r>
+    </w:p>
+    <w:p>
+      <w:r>
+        <w:rPr>
+          <w:highlight w:val="yellow"/>
+        </w:rPr>
+        <w:t xml:space="preserve">&lt;&lt;if [member.formLetterType == </w:t>
+      </w:r>
+      <w:r>
+        <w:rPr>
+          <w:highlight w:val="yellow"/>
+        </w:rPr>
+        <w:t>4</w:t>
+      </w:r>
+      <w:r>
+        <w:rPr>
+          <w:highlight w:val="yellow"/>
+        </w:rPr>
+        <w:t>]&gt;&gt;</w:t>
+      </w:r>
+    </w:p>
+    <w:p>
+      <w:r>
+        <w:t xml:space="preserve">Er hat von Ihrem Ausscheiden per </w:t>
+      </w:r>
+      <w:r>
+        <w:t>&lt;&lt;[formLetter.</w:t>
       </w:r>
       <w:r>
         <w:t>termOfOfficeEndDate</w:t>
       </w:r>
       <w:r>
-        <w:t>]&gt;&gt;</w:t>
-      </w:r>
-      <w:r>
-        <w:t xml:space="preserve"> als </w:t>
-      </w:r>
-      <w:r>
-        <w:rPr>
-          <w:b/>
-          <w:bCs/>
-        </w:rPr>
-        <w:t>&lt;&lt;[</w:t>
-      </w:r>
-      <w:r>
-        <w:rPr>
-          <w:b/>
-          <w:bCs/>
-        </w:rPr>
-        <w:t>member</w:t>
-      </w:r>
-      <w:r>
-        <w:rPr>
-          <w:b/>
-          <w:bCs/>
-        </w:rPr>
-        <w:t>.function]&gt;&gt;</w:t>
-      </w:r>
-      <w:r>
-        <w:t xml:space="preserve"> in folgendem Gremium Kenntnis genommen:</w:t>
-      </w:r>
-      <w:r>
-        <w:rPr>
-          <w:highlight w:val="yellow"/>
-        </w:rPr>
-        <w:t>&lt;&lt;/if&gt;&gt;</w:t>
-      </w:r>
-    </w:p>
-    <w:p>
-      <w:r>
-        <w:rPr>
-          <w:highlight w:val="yellow"/>
-        </w:rPr>
-        <w:t xml:space="preserve">&lt;&lt;if [member.formLetterType == </w:t>
-      </w:r>
-      <w:r>
-        <w:rPr>
-          <w:highlight w:val="yellow"/>
-        </w:rPr>
-        <w:t>4</w:t>
-      </w:r>
-      <w:r>
-        <w:rPr>
-          <w:highlight w:val="yellow"/>
-        </w:rPr>
-        <w:t>]&gt;&gt;</w:t>
-      </w:r>
-    </w:p>
-    <w:p>
-      <w:r>
-        <w:t xml:space="preserve">Er hat von Ihrem Ausscheiden per </w:t>
-      </w:r>
-      <w:r>
-        <w:t>&lt;&lt;[</w:t>
-      </w:r>
-      <w:r>
-        <w:t>formLetter</w:t>
-      </w:r>
-      <w:r>
-        <w:t>.</w:t>
-      </w:r>
-      <w:r>
-        <w:t>termOfOfficeEndDate</w:t>
-      </w:r>
-      <w:r>
-        <w:t>]&gt;&gt;</w:t>
+        <w:t>]:"dd.MM.yyyy"&gt;&gt;</w:t>
       </w:r>
       <w:r>
         <w:t xml:space="preserve"> </w:t>
@@ -2476,7 +2467,13 @@
         <w:rPr>
           <w:lang w:val="fr-CH"/>
         </w:rPr>
-        <w:t xml:space="preserve">&lt;&lt;[formLetter.termOfOfficeEndDate]&gt;&gt; </w:t>
+        <w:t>&lt;&lt;[formLetter.termOfOfficeEndDate]:"dd.MM.yyyy"&gt;&gt;</w:t>
+      </w:r>
+      <w:r>
+        <w:rPr>
+          <w:lang w:val="fr-CH"/>
+        </w:rPr>
+        <w:t xml:space="preserve"> </w:t>
       </w:r>
       <w:r>
         <w:rPr>
@@ -2548,7 +2545,19 @@
         <w:rPr>
           <w:lang w:val="fr-CH"/>
         </w:rPr>
-        <w:t xml:space="preserve"> &lt;&lt;[formLetter.termOfOfficeEndDate]&gt;&gt; </w:t>
+        <w:t xml:space="preserve"> </w:t>
+      </w:r>
+      <w:r>
+        <w:rPr>
+          <w:lang w:val="fr-CH"/>
+        </w:rPr>
+        <w:t>&lt;&lt;[formLetter.termOfOfficeEndDate]:"dd.MM.yyyy"&gt;&gt;</w:t>
+      </w:r>
+      <w:r>
+        <w:rPr>
+          <w:lang w:val="fr-CH"/>
+        </w:rPr>
+        <w:t xml:space="preserve"> </w:t>
       </w:r>
       <w:r>
         <w:rPr>
@@ -3452,7 +3461,19 @@
         <w:rPr>
           <w:lang w:val="it-CH"/>
         </w:rPr>
-        <w:t xml:space="preserve">Ha preso atto delle Sue dimissioni, con effetto dal &lt;&lt;[formLetter.termOfOfficeEndDate]&gt;&gt; , dalla funzione di </w:t>
+        <w:t xml:space="preserve">Ha preso atto delle Sue dimissioni, con effetto dal </w:t>
+      </w:r>
+      <w:r>
+        <w:rPr>
+          <w:lang w:val="it-CH"/>
+        </w:rPr>
+        <w:t>&lt;&lt;[formLetter.termOfOfficeEndDate]:"dd.MM.yyyy"&gt;&gt;</w:t>
+      </w:r>
+      <w:r>
+        <w:rPr>
+          <w:lang w:val="it-CH"/>
+        </w:rPr>
+        <w:t xml:space="preserve">, dalla funzione di </w:t>
       </w:r>
       <w:r>
         <w:rPr>
@@ -3507,7 +3528,19 @@
         <w:rPr>
           <w:lang w:val="it-CH"/>
         </w:rPr>
-        <w:t xml:space="preserve">Ha preso atto che, avendo raggiunto la durata massima del mandato, il &lt;&lt;[formLetter.termOfOfficeEndDate]&gt;&gt; lascerà la funzione di </w:t>
+        <w:t xml:space="preserve">Ha preso atto che, avendo raggiunto la durata massima del mandato, il </w:t>
+      </w:r>
+      <w:r>
+        <w:rPr>
+          <w:lang w:val="it-CH"/>
+        </w:rPr>
+        <w:t>&lt;&lt;[formLetter.termOfOfficeEndDate]:"dd.MM.yyyy"&gt;&gt;</w:t>
+      </w:r>
+      <w:r>
+        <w:rPr>
+          <w:lang w:val="it-CH"/>
+        </w:rPr>
+        <w:t xml:space="preserve"> lascerà la funzione di </w:t>
       </w:r>
       <w:r>
         <w:rPr>
@@ -3555,7 +3588,19 @@
         <w:rPr>
           <w:lang w:val="it-CH"/>
         </w:rPr>
-        <w:t xml:space="preserve">Ha preso atto che il &lt;&lt;[formLetter.termOfOfficeEndDate]&gt;&gt; lascerà la funzione di </w:t>
+        <w:t xml:space="preserve">Ha preso atto che il </w:t>
+      </w:r>
+      <w:r>
+        <w:rPr>
+          <w:lang w:val="it-CH"/>
+        </w:rPr>
+        <w:t>&lt;&lt;[formLetter.termOfOfficeEndDate]:"dd.MM.yyyy"&gt;&gt;</w:t>
+      </w:r>
+      <w:r>
+        <w:rPr>
+          <w:lang w:val="it-CH"/>
+        </w:rPr>
+        <w:t xml:space="preserve"> lascerà la funzione di </w:t>
       </w:r>
       <w:r>
         <w:rPr>
@@ -4208,7 +4253,6 @@
           <w:bCs/>
           <w:lang w:val="en-US"/>
         </w:rPr>
-        <w:lastRenderedPageBreak/>
         <w:t>&lt;&lt;[member.committeeName]&gt;&gt;</w:t>
       </w:r>
     </w:p>
@@ -4480,14 +4524,26 @@
         <w:rPr>
           <w:lang w:val="rm-CH"/>
         </w:rPr>
-        <w:t xml:space="preserve">El ha prendì enconuschientscha che Vus cuntanschais la durada maximala d'uffizi per ils &lt;&lt;[formLetter.termOfOfficeEndDate]&gt;&gt; sco </w:t>
-      </w:r>
-      <w:r>
-        <w:rPr>
-          <w:b/>
-          <w:bCs/>
+        <w:t xml:space="preserve">El ha prendì enconuschientscha che Vus cuntanschais la durada maximala d'uffizi per ils </w:t>
+      </w:r>
+      <w:r>
+        <w:rPr>
           <w:lang w:val="rm-CH"/>
         </w:rPr>
+        <w:t>&lt;&lt;[formLetter.termOfOfficeEndDate]:"dd.MM.yyyy"&gt;&gt;</w:t>
+      </w:r>
+      <w:r>
+        <w:rPr>
+          <w:lang w:val="rm-CH"/>
+        </w:rPr>
+        <w:t xml:space="preserve"> sco </w:t>
+      </w:r>
+      <w:r>
+        <w:rPr>
+          <w:b/>
+          <w:bCs/>
+          <w:lang w:val="rm-CH"/>
+        </w:rPr>
         <w:t>&lt;&lt;[member.function]&gt;&gt;</w:t>
       </w:r>
       <w:r>
@@ -4528,7 +4584,19 @@
         <w:rPr>
           <w:lang w:val="rm-CH"/>
         </w:rPr>
-        <w:t xml:space="preserve">El ha prendì enconuschientscha da Vossa extrada per ils &lt;&lt;[formLetter.termOfOfficeEndDate]&gt;&gt; sco </w:t>
+        <w:t xml:space="preserve">El ha prendì enconuschientscha da Vossa extrada per ils </w:t>
+      </w:r>
+      <w:r>
+        <w:rPr>
+          <w:lang w:val="rm-CH"/>
+        </w:rPr>
+        <w:t>&lt;&lt;[formLetter.termOfOfficeEndDate]:"dd.MM.yyyy"&gt;&gt;</w:t>
+      </w:r>
+      <w:r>
+        <w:rPr>
+          <w:lang w:val="rm-CH"/>
+        </w:rPr>
+        <w:t xml:space="preserve"> sco </w:t>
       </w:r>
       <w:r>
         <w:rPr>
@@ -4827,7 +4895,7 @@
         <w:rPr>
           <w:lang w:val="en-US"/>
         </w:rPr>
-        <w:t>Freundliche Grüsse</w:t>
+        <w:t>Salids amicabels</w:t>
       </w:r>
     </w:p>
     <w:p>
@@ -6038,6 +6106,7 @@
   <w:style w:type="character" w:default="1" w:styleId="Absatz-Standardschriftart">
     <w:name w:val="Default Paragraph Font"/>
     <w:uiPriority w:val="1"/>
+    <w:semiHidden/>
     <w:unhideWhenUsed/>
   </w:style>
   <w:style w:type="table" w:default="1" w:styleId="NormaleTabelle">

</xml_diff>

<commit_message>
feat: fix match quality in UID, fix selection of committees #BKDO-1769
</commit_message>
<xml_diff>
--- a/src/Bk.APG.Api/Templates/FormLetterGeneralElection.docx
+++ b/src/Bk.APG.Api/Templates/FormLetterGeneralElection.docx
@@ -1267,6 +1267,7 @@
     </w:p>
     <w:p>
       <w:r>
+        <w:lastRenderedPageBreak/>
         <w:t xml:space="preserve">Er hat von Ihrem Rücktritt per </w:t>
       </w:r>
       <w:r>
@@ -1329,7 +1330,6 @@
         <w:rPr>
           <w:highlight w:val="yellow"/>
         </w:rPr>
-        <w:lastRenderedPageBreak/>
         <w:t>&lt;&lt;/if&gt;&gt;</w:t>
       </w:r>
     </w:p>
@@ -2254,6 +2254,7 @@
           <w:highlight w:val="yellow"/>
           <w:lang w:val="fr-CH"/>
         </w:rPr>
+        <w:lastRenderedPageBreak/>
         <w:t>&lt;&lt;if [member.formLetterType == 1]&gt;&gt;</w:t>
       </w:r>
     </w:p>
@@ -3305,7 +3306,6 @@
         <w:rPr>
           <w:lang w:val="it-CH"/>
         </w:rPr>
-        <w:lastRenderedPageBreak/>
         <w:t>A nome del Consiglio federale, Le porgo le più sincere felicitazioni per questa nomina, augurandole successo e soddisfazione nella Sua nuova funzione.</w:t>
       </w:r>
     </w:p>
@@ -4138,6 +4138,7 @@
           <w:highlight w:val="cyan"/>
           <w:lang w:val="en-US"/>
         </w:rPr>
+        <w:lastRenderedPageBreak/>
         <w:t xml:space="preserve">&lt;&lt;if [member.formLetterLanguage == </w:t>
       </w:r>
       <w:r>
@@ -4895,6 +4896,7 @@
         <w:rPr>
           <w:lang w:val="en-US"/>
         </w:rPr>
+        <w:lastRenderedPageBreak/>
         <w:t>Salids amicabels</w:t>
       </w:r>
     </w:p>
@@ -5167,9 +5169,12 @@
       </w:r>
     </w:p>
     <w:sectPr>
-      <w:headerReference w:type="default" r:id="rId8"/>
-      <w:footerReference w:type="default" r:id="rId9"/>
-      <w:footerReference w:type="first" r:id="rId10"/>
+      <w:headerReference w:type="even" r:id="rId8"/>
+      <w:headerReference w:type="default" r:id="rId9"/>
+      <w:footerReference w:type="even" r:id="rId10"/>
+      <w:footerReference w:type="default" r:id="rId11"/>
+      <w:headerReference w:type="first" r:id="rId12"/>
+      <w:footerReference w:type="first" r:id="rId13"/>
       <w:pgSz w:w="11906" w:h="16838"/>
       <w:pgMar w:top="340" w:right="1134" w:bottom="907" w:left="1701" w:header="680" w:footer="198" w:gutter="0"/>
       <w:cols w:space="708"/>
@@ -5199,6 +5204,16 @@
 </file>
 
 <file path=word/footer1.xml><?xml version="1.0" encoding="utf-8"?>
+<w:ftr xmlns:wpc="http://schemas.microsoft.com/office/word/2010/wordprocessingCanvas" xmlns:cx="http://schemas.microsoft.com/office/drawing/2014/chartex" xmlns:cx1="http://schemas.microsoft.com/office/drawing/2015/9/8/chartex" xmlns:cx2="http://schemas.microsoft.com/office/drawing/2015/10/21/chartex" xmlns:cx3="http://schemas.microsoft.com/office/drawing/2016/5/9/chartex" xmlns:cx4="http://schemas.microsoft.com/office/drawing/2016/5/10/chartex" xmlns:cx5="http://schemas.microsoft.com/office/drawing/2016/5/11/chartex" xmlns:cx6="http://schemas.microsoft.com/office/drawing/2016/5/12/chartex" xmlns:cx7="http://schemas.microsoft.com/office/drawing/2016/5/13/chartex" xmlns:cx8="http://schemas.microsoft.com/office/drawing/2016/5/14/chartex" xmlns:mc="http://schemas.openxmlformats.org/markup-compatibility/2006" xmlns:aink="http://schemas.microsoft.com/office/drawing/2016/ink" xmlns:am3d="http://schemas.microsoft.com/office/drawing/2017/model3d" xmlns:o="urn:schemas-microsoft-com:office:office" xmlns:oel="http://schemas.microsoft.com/office/2019/extlst" xmlns:r="http://schemas.openxmlformats.org/officeDocument/2006/relationships" xmlns:m="http://schemas.openxmlformats.org/officeDocument/2006/math" xmlns:v="urn:schemas-microsoft-com:vml" xmlns:wp14="http://schemas.microsoft.com/office/word/2010/wordprocessingDrawing" xmlns:wp="http://schemas.openxmlformats.org/drawingml/2006/wordprocessingDrawing" xmlns:w10="urn:schemas-microsoft-com:office:word" xmlns:w="http://schemas.openxmlformats.org/wordprocessingml/2006/main" xmlns:w14="http://schemas.microsoft.com/office/word/2010/wordml" xmlns:w15="http://schemas.microsoft.com/office/word/2012/wordml" xmlns:w16cex="http://schemas.microsoft.com/office/word/2018/wordml/cex" xmlns:w16cid="http://schemas.microsoft.com/office/word/2016/wordml/cid" xmlns:w16="http://schemas.microsoft.com/office/word/2018/wordml" xmlns:w16du="http://schemas.microsoft.com/office/word/2023/wordml/word16du" xmlns:w16sdtdh="http://schemas.microsoft.com/office/word/2020/wordml/sdtdatahash" xmlns:w16sdtfl="http://schemas.microsoft.com/office/word/2024/wordml/sdtformatlock" xmlns:w16se="http://schemas.microsoft.com/office/word/2015/wordml/symex" xmlns:wpg="http://schemas.microsoft.com/office/word/2010/wordprocessingGroup" xmlns:wpi="http://schemas.microsoft.com/office/word/2010/wordprocessingInk" xmlns:wne="http://schemas.microsoft.com/office/word/2006/wordml" xmlns:wps="http://schemas.microsoft.com/office/word/2010/wordprocessingShape" mc:Ignorable="w14 w15 w16se w16cid w16 w16cex w16sdtdh w16sdtfl w16du wp14">
+  <w:p>
+    <w:pPr>
+      <w:pStyle w:val="Fuzeile"/>
+    </w:pPr>
+  </w:p>
+</w:ftr>
+</file>
+
+<file path=word/footer2.xml><?xml version="1.0" encoding="utf-8"?>
 <w:ftr xmlns:wpc="http://schemas.microsoft.com/office/word/2010/wordprocessingCanvas" xmlns:cx="http://schemas.microsoft.com/office/drawing/2014/chartex" xmlns:cx1="http://schemas.microsoft.com/office/drawing/2015/9/8/chartex" xmlns:cx2="http://schemas.microsoft.com/office/drawing/2015/10/21/chartex" xmlns:cx3="http://schemas.microsoft.com/office/drawing/2016/5/9/chartex" xmlns:cx4="http://schemas.microsoft.com/office/drawing/2016/5/10/chartex" xmlns:cx5="http://schemas.microsoft.com/office/drawing/2016/5/11/chartex" xmlns:cx6="http://schemas.microsoft.com/office/drawing/2016/5/12/chartex" xmlns:cx7="http://schemas.microsoft.com/office/drawing/2016/5/13/chartex" xmlns:cx8="http://schemas.microsoft.com/office/drawing/2016/5/14/chartex" xmlns:mc="http://schemas.openxmlformats.org/markup-compatibility/2006" xmlns:aink="http://schemas.microsoft.com/office/drawing/2016/ink" xmlns:am3d="http://schemas.microsoft.com/office/drawing/2017/model3d" xmlns:o="urn:schemas-microsoft-com:office:office" xmlns:oel="http://schemas.microsoft.com/office/2019/extlst" xmlns:r="http://schemas.openxmlformats.org/officeDocument/2006/relationships" xmlns:m="http://schemas.openxmlformats.org/officeDocument/2006/math" xmlns:v="urn:schemas-microsoft-com:vml" xmlns:wp14="http://schemas.microsoft.com/office/word/2010/wordprocessingDrawing" xmlns:wp="http://schemas.openxmlformats.org/drawingml/2006/wordprocessingDrawing" xmlns:w10="urn:schemas-microsoft-com:office:word" xmlns:w="http://schemas.openxmlformats.org/wordprocessingml/2006/main" xmlns:w14="http://schemas.microsoft.com/office/word/2010/wordml" xmlns:w15="http://schemas.microsoft.com/office/word/2012/wordml" xmlns:w16cex="http://schemas.microsoft.com/office/word/2018/wordml/cex" xmlns:w16cid="http://schemas.microsoft.com/office/word/2016/wordml/cid" xmlns:w16="http://schemas.microsoft.com/office/word/2018/wordml" xmlns:w16du="http://schemas.microsoft.com/office/word/2023/wordml/word16du" xmlns:w16sdtdh="http://schemas.microsoft.com/office/word/2020/wordml/sdtdatahash" xmlns:w16sdtfl="http://schemas.microsoft.com/office/word/2024/wordml/sdtformatlock" xmlns:w16se="http://schemas.microsoft.com/office/word/2015/wordml/symex" xmlns:wpg="http://schemas.microsoft.com/office/word/2010/wordprocessingGroup" xmlns:wpi="http://schemas.microsoft.com/office/word/2010/wordprocessingInk" xmlns:wne="http://schemas.microsoft.com/office/word/2006/wordml" xmlns:wps="http://schemas.microsoft.com/office/word/2010/wordprocessingShape" mc:Ignorable="w14 w15 w16se w16cid w16 w16cex w16sdtdh w16sdtfl w16du wp14">
   <w:tbl>
     <w:tblPr>
@@ -5234,7 +5249,40 @@
             <w:pStyle w:val="Fuzeile"/>
           </w:pPr>
           <w:r>
-            <w:t>&lt;&lt;[formLetter.senderOffice]&gt;&gt;</w:t>
+            <w:t>&lt;&lt;[formLetter.senderOffice</w:t>
+          </w:r>
+          <w:r>
+            <w:t>German</w:t>
+          </w:r>
+          <w:r>
+            <w:t>]&gt;&gt;</w:t>
+          </w:r>
+          <w:r>
+            <w:t>/</w:t>
+          </w:r>
+          <w:r>
+            <w:t xml:space="preserve"> </w:t>
+          </w:r>
+          <w:r>
+            <w:t>&lt;&lt;[formLetter.senderOffice</w:t>
+          </w:r>
+          <w:r>
+            <w:t>French</w:t>
+          </w:r>
+          <w:r>
+            <w:t>]&gt;&gt;</w:t>
+          </w:r>
+          <w:r>
+            <w:t>/</w:t>
+          </w:r>
+          <w:r>
+            <w:t xml:space="preserve"> &lt;&lt;[formLetter.senderOffice</w:t>
+          </w:r>
+          <w:r>
+            <w:t>Italian</w:t>
+          </w:r>
+          <w:r>
+            <w:t>]&gt;&gt;</w:t>
           </w:r>
         </w:p>
         <w:p>
@@ -5290,7 +5338,7 @@
 </w:ftr>
 </file>
 
-<file path=word/footer2.xml><?xml version="1.0" encoding="utf-8"?>
+<file path=word/footer3.xml><?xml version="1.0" encoding="utf-8"?>
 <w:ftr xmlns:wpc="http://schemas.microsoft.com/office/word/2010/wordprocessingCanvas" xmlns:cx="http://schemas.microsoft.com/office/drawing/2014/chartex" xmlns:cx1="http://schemas.microsoft.com/office/drawing/2015/9/8/chartex" xmlns:cx2="http://schemas.microsoft.com/office/drawing/2015/10/21/chartex" xmlns:cx3="http://schemas.microsoft.com/office/drawing/2016/5/9/chartex" xmlns:cx4="http://schemas.microsoft.com/office/drawing/2016/5/10/chartex" xmlns:cx5="http://schemas.microsoft.com/office/drawing/2016/5/11/chartex" xmlns:cx6="http://schemas.microsoft.com/office/drawing/2016/5/12/chartex" xmlns:cx7="http://schemas.microsoft.com/office/drawing/2016/5/13/chartex" xmlns:cx8="http://schemas.microsoft.com/office/drawing/2016/5/14/chartex" xmlns:mc="http://schemas.openxmlformats.org/markup-compatibility/2006" xmlns:aink="http://schemas.microsoft.com/office/drawing/2016/ink" xmlns:am3d="http://schemas.microsoft.com/office/drawing/2017/model3d" xmlns:o="urn:schemas-microsoft-com:office:office" xmlns:oel="http://schemas.microsoft.com/office/2019/extlst" xmlns:r="http://schemas.openxmlformats.org/officeDocument/2006/relationships" xmlns:m="http://schemas.openxmlformats.org/officeDocument/2006/math" xmlns:v="urn:schemas-microsoft-com:vml" xmlns:wp14="http://schemas.microsoft.com/office/word/2010/wordprocessingDrawing" xmlns:wp="http://schemas.openxmlformats.org/drawingml/2006/wordprocessingDrawing" xmlns:w10="urn:schemas-microsoft-com:office:word" xmlns:w="http://schemas.openxmlformats.org/wordprocessingml/2006/main" xmlns:w14="http://schemas.microsoft.com/office/word/2010/wordml" xmlns:w15="http://schemas.microsoft.com/office/word/2012/wordml" xmlns:w16cex="http://schemas.microsoft.com/office/word/2018/wordml/cex" xmlns:w16cid="http://schemas.microsoft.com/office/word/2016/wordml/cid" xmlns:w16="http://schemas.microsoft.com/office/word/2018/wordml" xmlns:w16du="http://schemas.microsoft.com/office/word/2023/wordml/word16du" xmlns:w16sdtdh="http://schemas.microsoft.com/office/word/2020/wordml/sdtdatahash" xmlns:w16sdtfl="http://schemas.microsoft.com/office/word/2024/wordml/sdtformatlock" xmlns:w16se="http://schemas.microsoft.com/office/word/2015/wordml/symex" xmlns:wpg="http://schemas.microsoft.com/office/word/2010/wordprocessingGroup" xmlns:wpi="http://schemas.microsoft.com/office/word/2010/wordprocessingInk" xmlns:wne="http://schemas.microsoft.com/office/word/2006/wordml" xmlns:wps="http://schemas.microsoft.com/office/word/2010/wordprocessingShape" mc:Ignorable="w14 w15 w16se w16cid w16 w16cex w16sdtdh w16sdtfl w16du wp14">
   <w:tbl>
     <w:tblPr>
@@ -5435,6 +5483,16 @@
 <w:hdr xmlns:wpc="http://schemas.microsoft.com/office/word/2010/wordprocessingCanvas" xmlns:cx="http://schemas.microsoft.com/office/drawing/2014/chartex" xmlns:cx1="http://schemas.microsoft.com/office/drawing/2015/9/8/chartex" xmlns:cx2="http://schemas.microsoft.com/office/drawing/2015/10/21/chartex" xmlns:cx3="http://schemas.microsoft.com/office/drawing/2016/5/9/chartex" xmlns:cx4="http://schemas.microsoft.com/office/drawing/2016/5/10/chartex" xmlns:cx5="http://schemas.microsoft.com/office/drawing/2016/5/11/chartex" xmlns:cx6="http://schemas.microsoft.com/office/drawing/2016/5/12/chartex" xmlns:cx7="http://schemas.microsoft.com/office/drawing/2016/5/13/chartex" xmlns:cx8="http://schemas.microsoft.com/office/drawing/2016/5/14/chartex" xmlns:mc="http://schemas.openxmlformats.org/markup-compatibility/2006" xmlns:aink="http://schemas.microsoft.com/office/drawing/2016/ink" xmlns:am3d="http://schemas.microsoft.com/office/drawing/2017/model3d" xmlns:o="urn:schemas-microsoft-com:office:office" xmlns:oel="http://schemas.microsoft.com/office/2019/extlst" xmlns:r="http://schemas.openxmlformats.org/officeDocument/2006/relationships" xmlns:m="http://schemas.openxmlformats.org/officeDocument/2006/math" xmlns:v="urn:schemas-microsoft-com:vml" xmlns:wp14="http://schemas.microsoft.com/office/word/2010/wordprocessingDrawing" xmlns:wp="http://schemas.openxmlformats.org/drawingml/2006/wordprocessingDrawing" xmlns:w10="urn:schemas-microsoft-com:office:word" xmlns:w="http://schemas.openxmlformats.org/wordprocessingml/2006/main" xmlns:w14="http://schemas.microsoft.com/office/word/2010/wordml" xmlns:w15="http://schemas.microsoft.com/office/word/2012/wordml" xmlns:w16cex="http://schemas.microsoft.com/office/word/2018/wordml/cex" xmlns:w16cid="http://schemas.microsoft.com/office/word/2016/wordml/cid" xmlns:w16="http://schemas.microsoft.com/office/word/2018/wordml" xmlns:w16du="http://schemas.microsoft.com/office/word/2023/wordml/word16du" xmlns:w16sdtdh="http://schemas.microsoft.com/office/word/2020/wordml/sdtdatahash" xmlns:w16sdtfl="http://schemas.microsoft.com/office/word/2024/wordml/sdtformatlock" xmlns:w16se="http://schemas.microsoft.com/office/word/2015/wordml/symex" xmlns:wpg="http://schemas.microsoft.com/office/word/2010/wordprocessingGroup" xmlns:wpi="http://schemas.microsoft.com/office/word/2010/wordprocessingInk" xmlns:wne="http://schemas.microsoft.com/office/word/2006/wordml" xmlns:wps="http://schemas.microsoft.com/office/word/2010/wordprocessingShape" mc:Ignorable="w14 w15 w16se w16cid w16 w16cex w16sdtdh w16sdtfl w16du wp14">
   <w:p>
     <w:pPr>
+      <w:pStyle w:val="Kopfzeile"/>
+    </w:pPr>
+  </w:p>
+</w:hdr>
+</file>
+
+<file path=word/header2.xml><?xml version="1.0" encoding="utf-8"?>
+<w:hdr xmlns:wpc="http://schemas.microsoft.com/office/word/2010/wordprocessingCanvas" xmlns:cx="http://schemas.microsoft.com/office/drawing/2014/chartex" xmlns:cx1="http://schemas.microsoft.com/office/drawing/2015/9/8/chartex" xmlns:cx2="http://schemas.microsoft.com/office/drawing/2015/10/21/chartex" xmlns:cx3="http://schemas.microsoft.com/office/drawing/2016/5/9/chartex" xmlns:cx4="http://schemas.microsoft.com/office/drawing/2016/5/10/chartex" xmlns:cx5="http://schemas.microsoft.com/office/drawing/2016/5/11/chartex" xmlns:cx6="http://schemas.microsoft.com/office/drawing/2016/5/12/chartex" xmlns:cx7="http://schemas.microsoft.com/office/drawing/2016/5/13/chartex" xmlns:cx8="http://schemas.microsoft.com/office/drawing/2016/5/14/chartex" xmlns:mc="http://schemas.openxmlformats.org/markup-compatibility/2006" xmlns:aink="http://schemas.microsoft.com/office/drawing/2016/ink" xmlns:am3d="http://schemas.microsoft.com/office/drawing/2017/model3d" xmlns:o="urn:schemas-microsoft-com:office:office" xmlns:oel="http://schemas.microsoft.com/office/2019/extlst" xmlns:r="http://schemas.openxmlformats.org/officeDocument/2006/relationships" xmlns:m="http://schemas.openxmlformats.org/officeDocument/2006/math" xmlns:v="urn:schemas-microsoft-com:vml" xmlns:wp14="http://schemas.microsoft.com/office/word/2010/wordprocessingDrawing" xmlns:wp="http://schemas.openxmlformats.org/drawingml/2006/wordprocessingDrawing" xmlns:w10="urn:schemas-microsoft-com:office:word" xmlns:w="http://schemas.openxmlformats.org/wordprocessingml/2006/main" xmlns:w14="http://schemas.microsoft.com/office/word/2010/wordml" xmlns:w15="http://schemas.microsoft.com/office/word/2012/wordml" xmlns:w16cex="http://schemas.microsoft.com/office/word/2018/wordml/cex" xmlns:w16cid="http://schemas.microsoft.com/office/word/2016/wordml/cid" xmlns:w16="http://schemas.microsoft.com/office/word/2018/wordml" xmlns:w16du="http://schemas.microsoft.com/office/word/2023/wordml/word16du" xmlns:w16sdtdh="http://schemas.microsoft.com/office/word/2020/wordml/sdtdatahash" xmlns:w16sdtfl="http://schemas.microsoft.com/office/word/2024/wordml/sdtformatlock" xmlns:w16se="http://schemas.microsoft.com/office/word/2015/wordml/symex" xmlns:wpg="http://schemas.microsoft.com/office/word/2010/wordprocessingGroup" xmlns:wpi="http://schemas.microsoft.com/office/word/2010/wordprocessingInk" xmlns:wne="http://schemas.microsoft.com/office/word/2006/wordml" xmlns:wps="http://schemas.microsoft.com/office/word/2010/wordprocessingShape" mc:Ignorable="w14 w15 w16se w16cid w16 w16cex w16sdtdh w16sdtfl w16du wp14">
+  <w:p>
+    <w:pPr>
       <w:pStyle w:val="Platzhalter"/>
       <w:rPr>
         <w:lang w:val="en-US"/>
@@ -5447,6 +5505,16 @@
       <w:rPr>
         <w:lang w:val="en-US"/>
       </w:rPr>
+    </w:pPr>
+  </w:p>
+</w:hdr>
+</file>
+
+<file path=word/header3.xml><?xml version="1.0" encoding="utf-8"?>
+<w:hdr xmlns:wpc="http://schemas.microsoft.com/office/word/2010/wordprocessingCanvas" xmlns:cx="http://schemas.microsoft.com/office/drawing/2014/chartex" xmlns:cx1="http://schemas.microsoft.com/office/drawing/2015/9/8/chartex" xmlns:cx2="http://schemas.microsoft.com/office/drawing/2015/10/21/chartex" xmlns:cx3="http://schemas.microsoft.com/office/drawing/2016/5/9/chartex" xmlns:cx4="http://schemas.microsoft.com/office/drawing/2016/5/10/chartex" xmlns:cx5="http://schemas.microsoft.com/office/drawing/2016/5/11/chartex" xmlns:cx6="http://schemas.microsoft.com/office/drawing/2016/5/12/chartex" xmlns:cx7="http://schemas.microsoft.com/office/drawing/2016/5/13/chartex" xmlns:cx8="http://schemas.microsoft.com/office/drawing/2016/5/14/chartex" xmlns:mc="http://schemas.openxmlformats.org/markup-compatibility/2006" xmlns:aink="http://schemas.microsoft.com/office/drawing/2016/ink" xmlns:am3d="http://schemas.microsoft.com/office/drawing/2017/model3d" xmlns:o="urn:schemas-microsoft-com:office:office" xmlns:oel="http://schemas.microsoft.com/office/2019/extlst" xmlns:r="http://schemas.openxmlformats.org/officeDocument/2006/relationships" xmlns:m="http://schemas.openxmlformats.org/officeDocument/2006/math" xmlns:v="urn:schemas-microsoft-com:vml" xmlns:wp14="http://schemas.microsoft.com/office/word/2010/wordprocessingDrawing" xmlns:wp="http://schemas.openxmlformats.org/drawingml/2006/wordprocessingDrawing" xmlns:w10="urn:schemas-microsoft-com:office:word" xmlns:w="http://schemas.openxmlformats.org/wordprocessingml/2006/main" xmlns:w14="http://schemas.microsoft.com/office/word/2010/wordml" xmlns:w15="http://schemas.microsoft.com/office/word/2012/wordml" xmlns:w16cex="http://schemas.microsoft.com/office/word/2018/wordml/cex" xmlns:w16cid="http://schemas.microsoft.com/office/word/2016/wordml/cid" xmlns:w16="http://schemas.microsoft.com/office/word/2018/wordml" xmlns:w16du="http://schemas.microsoft.com/office/word/2023/wordml/word16du" xmlns:w16sdtdh="http://schemas.microsoft.com/office/word/2020/wordml/sdtdatahash" xmlns:w16sdtfl="http://schemas.microsoft.com/office/word/2024/wordml/sdtformatlock" xmlns:w16se="http://schemas.microsoft.com/office/word/2015/wordml/symex" xmlns:wpg="http://schemas.microsoft.com/office/word/2010/wordprocessingGroup" xmlns:wpi="http://schemas.microsoft.com/office/word/2010/wordprocessingInk" xmlns:wne="http://schemas.microsoft.com/office/word/2006/wordml" xmlns:wps="http://schemas.microsoft.com/office/word/2010/wordprocessingShape" mc:Ignorable="w14 w15 w16se w16cid w16 w16cex w16sdtdh w16sdtfl w16du wp14">
+  <w:p>
+    <w:pPr>
+      <w:pStyle w:val="Kopfzeile"/>
     </w:pPr>
   </w:p>
 </w:hdr>

</xml_diff>